<commit_message>
Afegeix 3 exercicis de calcul de SAI a A02 (RA1-AA2)
Afegeix els exercicis 7, 8 i 9 a A02_Exercicis_SAI.docx, seguint
l'estructura de l'exercici resolt de referencia del professor (consum
DC dels components, potencia AC segons l'eficiencia de la PSU,
potencia real de cada SAI via VA x FP, i decisio aplicant un marge de
seguretat), amb valors i escenaris diferents per practicar:

- Exercici 7 (equip gamer, marge 25%): nomes un dels dos SAI compleix.
- Exercici 8 (estacio d'edicio de video, marge 20%): cap dels dos SAI
  compleix, calen obligar a buscar-ne un de mes gran.
- Exercici 9 (servidor NAS domestic, marge 40%): tots dos SAI
  compleixen, cal justificar quin triar per altres motius.

Mantenen exactament el mateix format visual (capsa gris + cos blanc,
Verdana) que la resta d'exercicis del document original.

Co-Authored-By: Claude Sonnet 5 <noreply@anthropic.com>
Claude-Session: https://claude.ai/code/session_01N3G5yf1RZohTyRwwRiXySq
</commit_message>
<xml_diff>
--- a/RA1 - Seguretat passiva/AA2 - Sistemes alimentacio ininterrompuda/A02_Exercicis_SAI.docx
+++ b/RA1 - Seguretat passiva/AA2 - Sistemes alimentacio ininterrompuda/A02_Exercicis_SAI.docx
@@ -1274,6 +1274,1062 @@
                 <w:rtl w:val="0"/>
               </w:rPr>
               <w:t xml:space="preserve">L’empresa TecnoGestió S.L., dedicada a la gestió documental i l’assessorament informàtic, té un petit despatx amb 4 ordinadors de sobretaula, una impressora-fotocopiadora multifunció i un ròuter d’accés a Internet. Davant les constants incidències amb el subministrament elèctric de la zona, la direcció ha decidit adquirir un SAI per garantir la continuïtat del servei i protegir els equips. Elabora un informe tècnic que reculli: 1) Una llista dels dispositius reals (marca i model) que representin l’equipament de l’empresa, indicant si n’hi ha algun que no calgui protegir amb el SAI (i per què). 2) El consum de cada dispositiu (watts i VA), segons les seves especificacions tècniques. 3) La potència total necessària per al SAI, sumant els consums i afegint-hi un marge de seguretat del 20%. 4) Tres models de SAI reals que compleixin aquesta potència, amb una autonomia mínima de 10 minuts i un pressupost raonable, indicant-ne les característiques tècniques i el preu (amb l’enllaç al distribuïdor consultat). 5) El model escollit, justificant la teva elecció.</w:t>
+            </w:r>
+          </w:p>
+        </w:tc>
+      </w:tr>
+    </w:tbl>
+    <w:p>
+      <w:pPr>
+        <w:rPr/>
+      </w:pPr>
+      <w:r>
+        <w:rPr>
+          <w:rtl w:val="0"/>
+        </w:rPr>
+      </w:r>
+    </w:p>
+    <w:tbl>
+      <w:tblPr>
+        <w:tblStyle w:val="Table7"/>
+        <w:tblW w:w="9630.0" w:type="dxa"/>
+        <w:jc w:val="left"/>
+        <w:tblInd w:w="-100.0" w:type="dxa"/>
+        <w:tblBorders>
+          <w:top w:color="000000" w:space="0" w:sz="8" w:val="single"/>
+          <w:left w:color="000000" w:space="0" w:sz="8" w:val="single"/>
+          <w:bottom w:color="000000" w:space="0" w:sz="8" w:val="single"/>
+          <w:right w:color="000000" w:space="0" w:sz="8" w:val="single"/>
+          <w:insideH w:color="000000" w:space="0" w:sz="8" w:val="single"/>
+          <w:insideV w:color="000000" w:space="0" w:sz="8" w:val="single"/>
+        </w:tblBorders>
+        <w:tblLayout w:type="fixed"/>
+        <w:tblLook w:val="0600"/>
+      </w:tblPr>
+      <w:tblGrid>
+        <w:gridCol w:w="9630"/>
+        <w:tblGridChange w:id="0">
+          <w:tblGrid>
+            <w:gridCol w:w="9630"/>
+          </w:tblGrid>
+        </w:tblGridChange>
+      </w:tblGrid>
+      <w:tr>
+        <w:trPr>
+          <w:cantSplit w:val="0"/>
+          <w:trHeight w:val="480" w:hRule="atLeast"/>
+          <w:tblHeader w:val="0"/>
+        </w:trPr>
+        <w:tc>
+          <w:tcPr>
+            <w:shd w:fill="d9d9d9" w:val="clear"/>
+            <w:tcMar>
+              <w:top w:w="100.0" w:type="dxa"/>
+              <w:left w:w="100.0" w:type="dxa"/>
+              <w:bottom w:w="100.0" w:type="dxa"/>
+              <w:right w:w="100.0" w:type="dxa"/>
+            </w:tcMar>
+          </w:tcPr>
+          <w:p>
+            <w:pPr>
+              <w:pStyle w:val="Heading2"/>
+              <w:pBdr>
+                <w:bottom w:color="auto" w:space="0" w:sz="0" w:val="none"/>
+              </w:pBdr>
+              <w:spacing w:before="0" w:line="276" w:lineRule="auto"/>
+              <w:jc w:val="left"/>
+              <w:rPr>
+                <w:rFonts w:ascii="Verdana" w:cs="Verdana" w:eastAsia="Verdana" w:hAnsi="Verdana"/>
+              </w:rPr>
+            </w:pPr>
+            <w:bookmarkStart w:colFirst="0" w:colLast="0" w:name="_exercici7" w:id="11"/>
+            <w:bookmarkEnd w:id="11"/>
+            <w:r>
+              <w:rPr>
+                <w:rFonts w:ascii="Verdana" w:cs="Verdana" w:eastAsia="Verdana" w:hAnsi="Verdana"/>
+                <w:rtl w:val="0"/>
+              </w:rPr>
+              <w:t>Enunciat exercici 7</w:t>
+            </w:r>
+          </w:p>
+        </w:tc>
+      </w:tr>
+      <w:tr>
+        <w:trPr>
+          <w:cantSplit w:val="0"/>
+          <w:trHeight w:val="840" w:hRule="atLeast"/>
+          <w:tblHeader w:val="0"/>
+        </w:trPr>
+        <w:tc>
+          <w:tcPr>
+            <w:shd w:fill="auto" w:val="clear"/>
+            <w:tcMar>
+              <w:top w:w="100.0" w:type="dxa"/>
+              <w:left w:w="100.0" w:type="dxa"/>
+              <w:bottom w:w="100.0" w:type="dxa"/>
+              <w:right w:w="100.0" w:type="dxa"/>
+            </w:tcMar>
+          </w:tcPr>
+          <w:p>
+            <w:pPr>
+              <w:widowControl w:val="1"/>
+              <w:spacing w:line="240" w:lineRule="auto"/>
+              <w:rPr>
+                <w:sz w:val="20"/>
+                <w:szCs w:val="20"/>
+              </w:rPr>
+            </w:pPr>
+            <w:r>
+              <w:rPr>
+                <w:sz w:val="20"/>
+                <w:szCs w:val="20"/>
+                <w:rtl w:val="0"/>
+              </w:rPr>
+            </w:r>
+            <w:r>
+              <w:rPr>
+                <w:rFonts w:ascii="Verdana" w:hAnsi="Verdana" w:cs="Verdana" w:eastAsia="Verdana"/>
+                <w:b w:val="0"/>
+                <w:sz w:val="20"/>
+              </w:rPr>
+              <w:t>Tens un equip gamer amb els següents consums: CPU 150 W, GPU 450 W, dos monitors de 40 W cadascun i perifèrics (teclat, ratolí i ventiladors RGB) 15 W. La font d'alimentació (PSU) té una capacitat indicada de 850 W i una eficiència del 90% (0,90). Has d'escollir un SAI per protegir l'equip davant talls de corrent. Es donen dues opcions:</w:t>
+            </w:r>
+          </w:p>
+          <w:tbl>
+            <w:tblPr>
+              <w:tblW w:type="dxa" w:w="9600"/>
+              <w:tblLook w:firstColumn="1" w:firstRow="1" w:lastColumn="0" w:lastRow="0" w:noHBand="0" w:noVBand="1" w:val="04A0"/>
+              <w:tblLayout w:type="fixed"/>
+            </w:tblPr>
+            <w:tblGrid>
+              <w:gridCol w:w="2400"/>
+              <w:gridCol w:w="3700"/>
+              <w:gridCol w:w="3500"/>
+            </w:tblGrid>
+            <w:tr>
+              <w:tc>
+                <w:tcPr>
+                  <w:tcW w:type="dxa" w:w="2400"/>
+                  <w:shd w:val="clear" w:fill="D9D9D9"/>
+                  <w:tcBorders>
+                    <w:top w:val="single" w:sz="8" w:space="0" w:color="000000"/>
+                    <w:left w:val="single" w:sz="8" w:space="0" w:color="000000"/>
+                    <w:bottom w:val="single" w:sz="8" w:space="0" w:color="000000"/>
+                    <w:right w:val="single" w:sz="8" w:space="0" w:color="000000"/>
+                  </w:tcBorders>
+                </w:tcPr>
+                <w:p>
+                  <w:r/>
+                  <w:r>
+                    <w:rPr>
+                      <w:rFonts w:ascii="Verdana" w:hAnsi="Verdana" w:cs="Verdana" w:eastAsia="Verdana"/>
+                      <w:b/>
+                      <w:sz w:val="20"/>
+                    </w:rPr>
+                    <w:t>SAI</w:t>
+                  </w:r>
+                </w:p>
+              </w:tc>
+              <w:tc>
+                <w:tcPr>
+                  <w:tcW w:type="dxa" w:w="3700"/>
+                  <w:shd w:val="clear" w:fill="D9D9D9"/>
+                  <w:tcBorders>
+                    <w:top w:val="single" w:sz="8" w:space="0" w:color="000000"/>
+                    <w:left w:val="single" w:sz="8" w:space="0" w:color="000000"/>
+                    <w:bottom w:val="single" w:sz="8" w:space="0" w:color="000000"/>
+                    <w:right w:val="single" w:sz="8" w:space="0" w:color="000000"/>
+                  </w:tcBorders>
+                </w:tcPr>
+                <w:p>
+                  <w:r/>
+                  <w:r>
+                    <w:rPr>
+                      <w:rFonts w:ascii="Verdana" w:hAnsi="Verdana" w:cs="Verdana" w:eastAsia="Verdana"/>
+                      <w:b/>
+                      <w:sz w:val="20"/>
+                    </w:rPr>
+                    <w:t>Potència aparent (VA)</w:t>
+                  </w:r>
+                </w:p>
+              </w:tc>
+              <w:tc>
+                <w:tcPr>
+                  <w:tcW w:type="dxa" w:w="3500"/>
+                  <w:shd w:val="clear" w:fill="D9D9D9"/>
+                  <w:tcBorders>
+                    <w:top w:val="single" w:sz="8" w:space="0" w:color="000000"/>
+                    <w:left w:val="single" w:sz="8" w:space="0" w:color="000000"/>
+                    <w:bottom w:val="single" w:sz="8" w:space="0" w:color="000000"/>
+                    <w:right w:val="single" w:sz="8" w:space="0" w:color="000000"/>
+                  </w:tcBorders>
+                </w:tcPr>
+                <w:p>
+                  <w:r/>
+                  <w:r>
+                    <w:rPr>
+                      <w:rFonts w:ascii="Verdana" w:hAnsi="Verdana" w:cs="Verdana" w:eastAsia="Verdana"/>
+                      <w:b/>
+                      <w:sz w:val="20"/>
+                    </w:rPr>
+                    <w:t>Factor de potència (FP)</w:t>
+                  </w:r>
+                </w:p>
+              </w:tc>
+            </w:tr>
+            <w:tr>
+              <w:tc>
+                <w:tcPr>
+                  <w:tcW w:type="dxa" w:w="2400"/>
+                  <w:tcBorders>
+                    <w:top w:val="single" w:sz="8" w:space="0" w:color="000000"/>
+                    <w:left w:val="single" w:sz="8" w:space="0" w:color="000000"/>
+                    <w:bottom w:val="single" w:sz="8" w:space="0" w:color="000000"/>
+                    <w:right w:val="single" w:sz="8" w:space="0" w:color="000000"/>
+                  </w:tcBorders>
+                </w:tcPr>
+                <w:p>
+                  <w:r/>
+                  <w:r>
+                    <w:rPr>
+                      <w:rFonts w:ascii="Verdana" w:hAnsi="Verdana" w:cs="Verdana" w:eastAsia="Verdana"/>
+                      <w:b w:val="0"/>
+                      <w:sz w:val="20"/>
+                    </w:rPr>
+                    <w:t>SAI A</w:t>
+                  </w:r>
+                </w:p>
+              </w:tc>
+              <w:tc>
+                <w:tcPr>
+                  <w:tcW w:type="dxa" w:w="3700"/>
+                  <w:tcBorders>
+                    <w:top w:val="single" w:sz="8" w:space="0" w:color="000000"/>
+                    <w:left w:val="single" w:sz="8" w:space="0" w:color="000000"/>
+                    <w:bottom w:val="single" w:sz="8" w:space="0" w:color="000000"/>
+                    <w:right w:val="single" w:sz="8" w:space="0" w:color="000000"/>
+                  </w:tcBorders>
+                </w:tcPr>
+                <w:p>
+                  <w:r/>
+                  <w:r>
+                    <w:rPr>
+                      <w:rFonts w:ascii="Verdana" w:hAnsi="Verdana" w:cs="Verdana" w:eastAsia="Verdana"/>
+                      <w:b w:val="0"/>
+                      <w:sz w:val="20"/>
+                    </w:rPr>
+                    <w:t>1500 VA</w:t>
+                  </w:r>
+                </w:p>
+              </w:tc>
+              <w:tc>
+                <w:tcPr>
+                  <w:tcW w:type="dxa" w:w="3500"/>
+                  <w:tcBorders>
+                    <w:top w:val="single" w:sz="8" w:space="0" w:color="000000"/>
+                    <w:left w:val="single" w:sz="8" w:space="0" w:color="000000"/>
+                    <w:bottom w:val="single" w:sz="8" w:space="0" w:color="000000"/>
+                    <w:right w:val="single" w:sz="8" w:space="0" w:color="000000"/>
+                  </w:tcBorders>
+                </w:tcPr>
+                <w:p>
+                  <w:r/>
+                  <w:r>
+                    <w:rPr>
+                      <w:rFonts w:ascii="Verdana" w:hAnsi="Verdana" w:cs="Verdana" w:eastAsia="Verdana"/>
+                      <w:b w:val="0"/>
+                      <w:sz w:val="20"/>
+                    </w:rPr>
+                    <w:t>0,6</w:t>
+                  </w:r>
+                </w:p>
+              </w:tc>
+            </w:tr>
+            <w:tr>
+              <w:tc>
+                <w:tcPr>
+                  <w:tcW w:type="dxa" w:w="2400"/>
+                  <w:tcBorders>
+                    <w:top w:val="single" w:sz="8" w:space="0" w:color="000000"/>
+                    <w:left w:val="single" w:sz="8" w:space="0" w:color="000000"/>
+                    <w:bottom w:val="single" w:sz="8" w:space="0" w:color="000000"/>
+                    <w:right w:val="single" w:sz="8" w:space="0" w:color="000000"/>
+                  </w:tcBorders>
+                </w:tcPr>
+                <w:p>
+                  <w:r/>
+                  <w:r>
+                    <w:rPr>
+                      <w:rFonts w:ascii="Verdana" w:hAnsi="Verdana" w:cs="Verdana" w:eastAsia="Verdana"/>
+                      <w:b w:val="0"/>
+                      <w:sz w:val="20"/>
+                    </w:rPr>
+                    <w:t>SAI B</w:t>
+                  </w:r>
+                </w:p>
+              </w:tc>
+              <w:tc>
+                <w:tcPr>
+                  <w:tcW w:type="dxa" w:w="3700"/>
+                  <w:tcBorders>
+                    <w:top w:val="single" w:sz="8" w:space="0" w:color="000000"/>
+                    <w:left w:val="single" w:sz="8" w:space="0" w:color="000000"/>
+                    <w:bottom w:val="single" w:sz="8" w:space="0" w:color="000000"/>
+                    <w:right w:val="single" w:sz="8" w:space="0" w:color="000000"/>
+                  </w:tcBorders>
+                </w:tcPr>
+                <w:p>
+                  <w:r/>
+                  <w:r>
+                    <w:rPr>
+                      <w:rFonts w:ascii="Verdana" w:hAnsi="Verdana" w:cs="Verdana" w:eastAsia="Verdana"/>
+                      <w:b w:val="0"/>
+                      <w:sz w:val="20"/>
+                    </w:rPr>
+                    <w:t>1600 VA</w:t>
+                  </w:r>
+                </w:p>
+              </w:tc>
+              <w:tc>
+                <w:tcPr>
+                  <w:tcW w:type="dxa" w:w="3500"/>
+                  <w:tcBorders>
+                    <w:top w:val="single" w:sz="8" w:space="0" w:color="000000"/>
+                    <w:left w:val="single" w:sz="8" w:space="0" w:color="000000"/>
+                    <w:bottom w:val="single" w:sz="8" w:space="0" w:color="000000"/>
+                    <w:right w:val="single" w:sz="8" w:space="0" w:color="000000"/>
+                  </w:tcBorders>
+                </w:tcPr>
+                <w:p>
+                  <w:r/>
+                  <w:r>
+                    <w:rPr>
+                      <w:rFonts w:ascii="Verdana" w:hAnsi="Verdana" w:cs="Verdana" w:eastAsia="Verdana"/>
+                      <w:b w:val="0"/>
+                      <w:sz w:val="20"/>
+                    </w:rPr>
+                    <w:t>0,65</w:t>
+                  </w:r>
+                </w:p>
+              </w:tc>
+            </w:tr>
+          </w:tbl>
+          <w:p/>
+          <w:p>
+            <w:pPr>
+              <w:spacing w:line="240" w:lineRule="auto"/>
+            </w:pPr>
+            <w:r>
+              <w:rPr>
+                <w:rFonts w:ascii="Verdana" w:hAnsi="Verdana" w:cs="Verdana" w:eastAsia="Verdana"/>
+                <w:b w:val="0"/>
+                <w:sz w:val="20"/>
+              </w:rPr>
+              <w:t>Tasques: 1) Calcula la potència DC total demandada pels components. 2) Calcula la potència AC que haurà de subministrar la xarxa/SAI tenint en compte l'eficiència de la PSU. 3) Calcula la potència real disponible de cada SAI (VA × FP). 4) Aplicant un marge de seguretat del 25%, quin SAI recomanaries i per què?</w:t>
+            </w:r>
+          </w:p>
+        </w:tc>
+      </w:tr>
+    </w:tbl>
+    <w:p>
+      <w:pPr>
+        <w:rPr/>
+      </w:pPr>
+      <w:r>
+        <w:rPr>
+          <w:rtl w:val="0"/>
+        </w:rPr>
+      </w:r>
+    </w:p>
+    <w:tbl>
+      <w:tblPr>
+        <w:tblStyle w:val="Table7"/>
+        <w:tblW w:w="9630.0" w:type="dxa"/>
+        <w:jc w:val="left"/>
+        <w:tblInd w:w="-100.0" w:type="dxa"/>
+        <w:tblBorders>
+          <w:top w:color="000000" w:space="0" w:sz="8" w:val="single"/>
+          <w:left w:color="000000" w:space="0" w:sz="8" w:val="single"/>
+          <w:bottom w:color="000000" w:space="0" w:sz="8" w:val="single"/>
+          <w:right w:color="000000" w:space="0" w:sz="8" w:val="single"/>
+          <w:insideH w:color="000000" w:space="0" w:sz="8" w:val="single"/>
+          <w:insideV w:color="000000" w:space="0" w:sz="8" w:val="single"/>
+        </w:tblBorders>
+        <w:tblLayout w:type="fixed"/>
+        <w:tblLook w:val="0600"/>
+      </w:tblPr>
+      <w:tblGrid>
+        <w:gridCol w:w="9630"/>
+        <w:tblGridChange w:id="0">
+          <w:tblGrid>
+            <w:gridCol w:w="9630"/>
+          </w:tblGrid>
+        </w:tblGridChange>
+      </w:tblGrid>
+      <w:tr>
+        <w:trPr>
+          <w:cantSplit w:val="0"/>
+          <w:trHeight w:val="480" w:hRule="atLeast"/>
+          <w:tblHeader w:val="0"/>
+        </w:trPr>
+        <w:tc>
+          <w:tcPr>
+            <w:shd w:fill="d9d9d9" w:val="clear"/>
+            <w:tcMar>
+              <w:top w:w="100.0" w:type="dxa"/>
+              <w:left w:w="100.0" w:type="dxa"/>
+              <w:bottom w:w="100.0" w:type="dxa"/>
+              <w:right w:w="100.0" w:type="dxa"/>
+            </w:tcMar>
+          </w:tcPr>
+          <w:p>
+            <w:pPr>
+              <w:pStyle w:val="Heading2"/>
+              <w:pBdr>
+                <w:bottom w:color="auto" w:space="0" w:sz="0" w:val="none"/>
+              </w:pBdr>
+              <w:spacing w:before="0" w:line="276" w:lineRule="auto"/>
+              <w:jc w:val="left"/>
+              <w:rPr>
+                <w:rFonts w:ascii="Verdana" w:cs="Verdana" w:eastAsia="Verdana" w:hAnsi="Verdana"/>
+              </w:rPr>
+            </w:pPr>
+            <w:bookmarkStart w:colFirst="0" w:colLast="0" w:name="_exercici8" w:id="11"/>
+            <w:bookmarkEnd w:id="11"/>
+            <w:r>
+              <w:rPr>
+                <w:rFonts w:ascii="Verdana" w:cs="Verdana" w:eastAsia="Verdana" w:hAnsi="Verdana"/>
+                <w:rtl w:val="0"/>
+              </w:rPr>
+              <w:t>Enunciat exercici 8</w:t>
+            </w:r>
+          </w:p>
+        </w:tc>
+      </w:tr>
+      <w:tr>
+        <w:trPr>
+          <w:cantSplit w:val="0"/>
+          <w:trHeight w:val="840" w:hRule="atLeast"/>
+          <w:tblHeader w:val="0"/>
+        </w:trPr>
+        <w:tc>
+          <w:tcPr>
+            <w:shd w:fill="auto" w:val="clear"/>
+            <w:tcMar>
+              <w:top w:w="100.0" w:type="dxa"/>
+              <w:left w:w="100.0" w:type="dxa"/>
+              <w:bottom w:w="100.0" w:type="dxa"/>
+              <w:right w:w="100.0" w:type="dxa"/>
+            </w:tcMar>
+          </w:tcPr>
+          <w:p>
+            <w:pPr>
+              <w:widowControl w:val="1"/>
+              <w:spacing w:line="240" w:lineRule="auto"/>
+              <w:rPr>
+                <w:sz w:val="20"/>
+                <w:szCs w:val="20"/>
+              </w:rPr>
+            </w:pPr>
+            <w:r>
+              <w:rPr>
+                <w:sz w:val="20"/>
+                <w:szCs w:val="20"/>
+                <w:rtl w:val="0"/>
+              </w:rPr>
+            </w:r>
+            <w:r>
+              <w:rPr>
+                <w:rFonts w:ascii="Verdana" w:hAnsi="Verdana" w:cs="Verdana" w:eastAsia="Verdana"/>
+                <w:b w:val="0"/>
+                <w:sz w:val="20"/>
+              </w:rPr>
+              <w:t>Tens una estació de treball d'edició de vídeo amb els següents consums: CPU 105 W, GPU 250 W, monitor professional 65 W, disc extern SSD 10 W i targeta de captura de vídeo 20 W. La font d'alimentació (PSU) té una capacitat indicada de 650 W i una eficiència del 80% (0,80). Has d'escollir un SAI per protegir l'equip davant talls de corrent. Es donen dues opcions:</w:t>
+            </w:r>
+          </w:p>
+          <w:tbl>
+            <w:tblPr>
+              <w:tblW w:type="dxa" w:w="9600"/>
+              <w:tblLook w:firstColumn="1" w:firstRow="1" w:lastColumn="0" w:lastRow="0" w:noHBand="0" w:noVBand="1" w:val="04A0"/>
+              <w:tblLayout w:type="fixed"/>
+            </w:tblPr>
+            <w:tblGrid>
+              <w:gridCol w:w="2400"/>
+              <w:gridCol w:w="3700"/>
+              <w:gridCol w:w="3500"/>
+            </w:tblGrid>
+            <w:tr>
+              <w:tc>
+                <w:tcPr>
+                  <w:tcW w:type="dxa" w:w="2400"/>
+                  <w:shd w:val="clear" w:fill="D9D9D9"/>
+                  <w:tcBorders>
+                    <w:top w:val="single" w:sz="8" w:space="0" w:color="000000"/>
+                    <w:left w:val="single" w:sz="8" w:space="0" w:color="000000"/>
+                    <w:bottom w:val="single" w:sz="8" w:space="0" w:color="000000"/>
+                    <w:right w:val="single" w:sz="8" w:space="0" w:color="000000"/>
+                  </w:tcBorders>
+                </w:tcPr>
+                <w:p>
+                  <w:r/>
+                  <w:r>
+                    <w:rPr>
+                      <w:rFonts w:ascii="Verdana" w:hAnsi="Verdana" w:cs="Verdana" w:eastAsia="Verdana"/>
+                      <w:b/>
+                      <w:sz w:val="20"/>
+                    </w:rPr>
+                    <w:t>SAI</w:t>
+                  </w:r>
+                </w:p>
+              </w:tc>
+              <w:tc>
+                <w:tcPr>
+                  <w:tcW w:type="dxa" w:w="3700"/>
+                  <w:shd w:val="clear" w:fill="D9D9D9"/>
+                  <w:tcBorders>
+                    <w:top w:val="single" w:sz="8" w:space="0" w:color="000000"/>
+                    <w:left w:val="single" w:sz="8" w:space="0" w:color="000000"/>
+                    <w:bottom w:val="single" w:sz="8" w:space="0" w:color="000000"/>
+                    <w:right w:val="single" w:sz="8" w:space="0" w:color="000000"/>
+                  </w:tcBorders>
+                </w:tcPr>
+                <w:p>
+                  <w:r/>
+                  <w:r>
+                    <w:rPr>
+                      <w:rFonts w:ascii="Verdana" w:hAnsi="Verdana" w:cs="Verdana" w:eastAsia="Verdana"/>
+                      <w:b/>
+                      <w:sz w:val="20"/>
+                    </w:rPr>
+                    <w:t>Potència aparent (VA)</w:t>
+                  </w:r>
+                </w:p>
+              </w:tc>
+              <w:tc>
+                <w:tcPr>
+                  <w:tcW w:type="dxa" w:w="3500"/>
+                  <w:shd w:val="clear" w:fill="D9D9D9"/>
+                  <w:tcBorders>
+                    <w:top w:val="single" w:sz="8" w:space="0" w:color="000000"/>
+                    <w:left w:val="single" w:sz="8" w:space="0" w:color="000000"/>
+                    <w:bottom w:val="single" w:sz="8" w:space="0" w:color="000000"/>
+                    <w:right w:val="single" w:sz="8" w:space="0" w:color="000000"/>
+                  </w:tcBorders>
+                </w:tcPr>
+                <w:p>
+                  <w:r/>
+                  <w:r>
+                    <w:rPr>
+                      <w:rFonts w:ascii="Verdana" w:hAnsi="Verdana" w:cs="Verdana" w:eastAsia="Verdana"/>
+                      <w:b/>
+                      <w:sz w:val="20"/>
+                    </w:rPr>
+                    <w:t>Factor de potència (FP)</w:t>
+                  </w:r>
+                </w:p>
+              </w:tc>
+            </w:tr>
+            <w:tr>
+              <w:tc>
+                <w:tcPr>
+                  <w:tcW w:type="dxa" w:w="2400"/>
+                  <w:tcBorders>
+                    <w:top w:val="single" w:sz="8" w:space="0" w:color="000000"/>
+                    <w:left w:val="single" w:sz="8" w:space="0" w:color="000000"/>
+                    <w:bottom w:val="single" w:sz="8" w:space="0" w:color="000000"/>
+                    <w:right w:val="single" w:sz="8" w:space="0" w:color="000000"/>
+                  </w:tcBorders>
+                </w:tcPr>
+                <w:p>
+                  <w:r/>
+                  <w:r>
+                    <w:rPr>
+                      <w:rFonts w:ascii="Verdana" w:hAnsi="Verdana" w:cs="Verdana" w:eastAsia="Verdana"/>
+                      <w:b w:val="0"/>
+                      <w:sz w:val="20"/>
+                    </w:rPr>
+                    <w:t>SAI C</w:t>
+                  </w:r>
+                </w:p>
+              </w:tc>
+              <w:tc>
+                <w:tcPr>
+                  <w:tcW w:type="dxa" w:w="3700"/>
+                  <w:tcBorders>
+                    <w:top w:val="single" w:sz="8" w:space="0" w:color="000000"/>
+                    <w:left w:val="single" w:sz="8" w:space="0" w:color="000000"/>
+                    <w:bottom w:val="single" w:sz="8" w:space="0" w:color="000000"/>
+                    <w:right w:val="single" w:sz="8" w:space="0" w:color="000000"/>
+                  </w:tcBorders>
+                </w:tcPr>
+                <w:p>
+                  <w:r/>
+                  <w:r>
+                    <w:rPr>
+                      <w:rFonts w:ascii="Verdana" w:hAnsi="Verdana" w:cs="Verdana" w:eastAsia="Verdana"/>
+                      <w:b w:val="0"/>
+                      <w:sz w:val="20"/>
+                    </w:rPr>
+                    <w:t>900 VA</w:t>
+                  </w:r>
+                </w:p>
+              </w:tc>
+              <w:tc>
+                <w:tcPr>
+                  <w:tcW w:type="dxa" w:w="3500"/>
+                  <w:tcBorders>
+                    <w:top w:val="single" w:sz="8" w:space="0" w:color="000000"/>
+                    <w:left w:val="single" w:sz="8" w:space="0" w:color="000000"/>
+                    <w:bottom w:val="single" w:sz="8" w:space="0" w:color="000000"/>
+                    <w:right w:val="single" w:sz="8" w:space="0" w:color="000000"/>
+                  </w:tcBorders>
+                </w:tcPr>
+                <w:p>
+                  <w:r/>
+                  <w:r>
+                    <w:rPr>
+                      <w:rFonts w:ascii="Verdana" w:hAnsi="Verdana" w:cs="Verdana" w:eastAsia="Verdana"/>
+                      <w:b w:val="0"/>
+                      <w:sz w:val="20"/>
+                    </w:rPr>
+                    <w:t>0,55</w:t>
+                  </w:r>
+                </w:p>
+              </w:tc>
+            </w:tr>
+            <w:tr>
+              <w:tc>
+                <w:tcPr>
+                  <w:tcW w:type="dxa" w:w="2400"/>
+                  <w:tcBorders>
+                    <w:top w:val="single" w:sz="8" w:space="0" w:color="000000"/>
+                    <w:left w:val="single" w:sz="8" w:space="0" w:color="000000"/>
+                    <w:bottom w:val="single" w:sz="8" w:space="0" w:color="000000"/>
+                    <w:right w:val="single" w:sz="8" w:space="0" w:color="000000"/>
+                  </w:tcBorders>
+                </w:tcPr>
+                <w:p>
+                  <w:r/>
+                  <w:r>
+                    <w:rPr>
+                      <w:rFonts w:ascii="Verdana" w:hAnsi="Verdana" w:cs="Verdana" w:eastAsia="Verdana"/>
+                      <w:b w:val="0"/>
+                      <w:sz w:val="20"/>
+                    </w:rPr>
+                    <w:t>SAI D</w:t>
+                  </w:r>
+                </w:p>
+              </w:tc>
+              <w:tc>
+                <w:tcPr>
+                  <w:tcW w:type="dxa" w:w="3700"/>
+                  <w:tcBorders>
+                    <w:top w:val="single" w:sz="8" w:space="0" w:color="000000"/>
+                    <w:left w:val="single" w:sz="8" w:space="0" w:color="000000"/>
+                    <w:bottom w:val="single" w:sz="8" w:space="0" w:color="000000"/>
+                    <w:right w:val="single" w:sz="8" w:space="0" w:color="000000"/>
+                  </w:tcBorders>
+                </w:tcPr>
+                <w:p>
+                  <w:r/>
+                  <w:r>
+                    <w:rPr>
+                      <w:rFonts w:ascii="Verdana" w:hAnsi="Verdana" w:cs="Verdana" w:eastAsia="Verdana"/>
+                      <w:b w:val="0"/>
+                      <w:sz w:val="20"/>
+                    </w:rPr>
+                    <w:t>1100 VA</w:t>
+                  </w:r>
+                </w:p>
+              </w:tc>
+              <w:tc>
+                <w:tcPr>
+                  <w:tcW w:type="dxa" w:w="3500"/>
+                  <w:tcBorders>
+                    <w:top w:val="single" w:sz="8" w:space="0" w:color="000000"/>
+                    <w:left w:val="single" w:sz="8" w:space="0" w:color="000000"/>
+                    <w:bottom w:val="single" w:sz="8" w:space="0" w:color="000000"/>
+                    <w:right w:val="single" w:sz="8" w:space="0" w:color="000000"/>
+                  </w:tcBorders>
+                </w:tcPr>
+                <w:p>
+                  <w:r/>
+                  <w:r>
+                    <w:rPr>
+                      <w:rFonts w:ascii="Verdana" w:hAnsi="Verdana" w:cs="Verdana" w:eastAsia="Verdana"/>
+                      <w:b w:val="0"/>
+                      <w:sz w:val="20"/>
+                    </w:rPr>
+                    <w:t>0,6</w:t>
+                  </w:r>
+                </w:p>
+              </w:tc>
+            </w:tr>
+          </w:tbl>
+          <w:p/>
+          <w:p>
+            <w:pPr>
+              <w:spacing w:line="240" w:lineRule="auto"/>
+            </w:pPr>
+            <w:r>
+              <w:rPr>
+                <w:rFonts w:ascii="Verdana" w:hAnsi="Verdana" w:cs="Verdana" w:eastAsia="Verdana"/>
+                <w:b w:val="0"/>
+                <w:sz w:val="20"/>
+              </w:rPr>
+              <w:t>Tasques: 1) Calcula la potència DC total demandada pels components. 2) Calcula la potència AC que haurà de subministrar la xarxa/SAI tenint en compte l'eficiència de la PSU. 3) Calcula la potència real disponible de cada SAI (VA × FP). 4) Aplicant un marge de seguretat del 20%, és suficient algun dels dos SAI? Si no ho és cap dels dos, què hauries de fer o recomanar?</w:t>
+            </w:r>
+          </w:p>
+        </w:tc>
+      </w:tr>
+    </w:tbl>
+    <w:p>
+      <w:pPr>
+        <w:rPr/>
+      </w:pPr>
+      <w:r>
+        <w:rPr>
+          <w:rtl w:val="0"/>
+        </w:rPr>
+      </w:r>
+    </w:p>
+    <w:tbl>
+      <w:tblPr>
+        <w:tblStyle w:val="Table7"/>
+        <w:tblW w:w="9630.0" w:type="dxa"/>
+        <w:jc w:val="left"/>
+        <w:tblInd w:w="-100.0" w:type="dxa"/>
+        <w:tblBorders>
+          <w:top w:color="000000" w:space="0" w:sz="8" w:val="single"/>
+          <w:left w:color="000000" w:space="0" w:sz="8" w:val="single"/>
+          <w:bottom w:color="000000" w:space="0" w:sz="8" w:val="single"/>
+          <w:right w:color="000000" w:space="0" w:sz="8" w:val="single"/>
+          <w:insideH w:color="000000" w:space="0" w:sz="8" w:val="single"/>
+          <w:insideV w:color="000000" w:space="0" w:sz="8" w:val="single"/>
+        </w:tblBorders>
+        <w:tblLayout w:type="fixed"/>
+        <w:tblLook w:val="0600"/>
+      </w:tblPr>
+      <w:tblGrid>
+        <w:gridCol w:w="9630"/>
+        <w:tblGridChange w:id="0">
+          <w:tblGrid>
+            <w:gridCol w:w="9630"/>
+          </w:tblGrid>
+        </w:tblGridChange>
+      </w:tblGrid>
+      <w:tr>
+        <w:trPr>
+          <w:cantSplit w:val="0"/>
+          <w:trHeight w:val="480" w:hRule="atLeast"/>
+          <w:tblHeader w:val="0"/>
+        </w:trPr>
+        <w:tc>
+          <w:tcPr>
+            <w:shd w:fill="d9d9d9" w:val="clear"/>
+            <w:tcMar>
+              <w:top w:w="100.0" w:type="dxa"/>
+              <w:left w:w="100.0" w:type="dxa"/>
+              <w:bottom w:w="100.0" w:type="dxa"/>
+              <w:right w:w="100.0" w:type="dxa"/>
+            </w:tcMar>
+          </w:tcPr>
+          <w:p>
+            <w:pPr>
+              <w:pStyle w:val="Heading2"/>
+              <w:pBdr>
+                <w:bottom w:color="auto" w:space="0" w:sz="0" w:val="none"/>
+              </w:pBdr>
+              <w:spacing w:before="0" w:line="276" w:lineRule="auto"/>
+              <w:jc w:val="left"/>
+              <w:rPr>
+                <w:rFonts w:ascii="Verdana" w:cs="Verdana" w:eastAsia="Verdana" w:hAnsi="Verdana"/>
+              </w:rPr>
+            </w:pPr>
+            <w:bookmarkStart w:colFirst="0" w:colLast="0" w:name="_exercici9" w:id="11"/>
+            <w:bookmarkEnd w:id="11"/>
+            <w:r>
+              <w:rPr>
+                <w:rFonts w:ascii="Verdana" w:cs="Verdana" w:eastAsia="Verdana" w:hAnsi="Verdana"/>
+                <w:rtl w:val="0"/>
+              </w:rPr>
+              <w:t>Enunciat exercici 9</w:t>
+            </w:r>
+          </w:p>
+        </w:tc>
+      </w:tr>
+      <w:tr>
+        <w:trPr>
+          <w:cantSplit w:val="0"/>
+          <w:trHeight w:val="840" w:hRule="atLeast"/>
+          <w:tblHeader w:val="0"/>
+        </w:trPr>
+        <w:tc>
+          <w:tcPr>
+            <w:shd w:fill="auto" w:val="clear"/>
+            <w:tcMar>
+              <w:top w:w="100.0" w:type="dxa"/>
+              <w:left w:w="100.0" w:type="dxa"/>
+              <w:bottom w:w="100.0" w:type="dxa"/>
+              <w:right w:w="100.0" w:type="dxa"/>
+            </w:tcMar>
+          </w:tcPr>
+          <w:p>
+            <w:pPr>
+              <w:widowControl w:val="1"/>
+              <w:spacing w:line="240" w:lineRule="auto"/>
+              <w:rPr>
+                <w:sz w:val="20"/>
+                <w:szCs w:val="20"/>
+              </w:rPr>
+            </w:pPr>
+            <w:r>
+              <w:rPr>
+                <w:sz w:val="20"/>
+                <w:szCs w:val="20"/>
+                <w:rtl w:val="0"/>
+              </w:rPr>
+            </w:r>
+            <w:r>
+              <w:rPr>
+                <w:rFonts w:ascii="Verdana" w:hAnsi="Verdana" w:cs="Verdana" w:eastAsia="Verdana"/>
+                <w:b w:val="0"/>
+                <w:sz w:val="20"/>
+              </w:rPr>
+              <w:t>Tens un petit servidor NAS domèstic amb els següents consums: processador del NAS 15 W, quatre discs durs de 8 W cadascun, placa base i memòria RAM 10 W, i ventiladors 5 W. La font d'alimentació (PSU) té una capacitat indicada de 300 W i una eficiència del 88% (0,88). Com que és un servidor que ha de estar sempre operatiu, es vol aplicar un marge de seguretat més gran que en els casos anteriors. Es donen dues opcions de SAI:</w:t>
+            </w:r>
+          </w:p>
+          <w:tbl>
+            <w:tblPr>
+              <w:tblW w:type="dxa" w:w="9600"/>
+              <w:tblLook w:firstColumn="1" w:firstRow="1" w:lastColumn="0" w:lastRow="0" w:noHBand="0" w:noVBand="1" w:val="04A0"/>
+              <w:tblLayout w:type="fixed"/>
+            </w:tblPr>
+            <w:tblGrid>
+              <w:gridCol w:w="2400"/>
+              <w:gridCol w:w="3700"/>
+              <w:gridCol w:w="3500"/>
+            </w:tblGrid>
+            <w:tr>
+              <w:tc>
+                <w:tcPr>
+                  <w:tcW w:type="dxa" w:w="2400"/>
+                  <w:shd w:val="clear" w:fill="D9D9D9"/>
+                  <w:tcBorders>
+                    <w:top w:val="single" w:sz="8" w:space="0" w:color="000000"/>
+                    <w:left w:val="single" w:sz="8" w:space="0" w:color="000000"/>
+                    <w:bottom w:val="single" w:sz="8" w:space="0" w:color="000000"/>
+                    <w:right w:val="single" w:sz="8" w:space="0" w:color="000000"/>
+                  </w:tcBorders>
+                </w:tcPr>
+                <w:p>
+                  <w:r/>
+                  <w:r>
+                    <w:rPr>
+                      <w:rFonts w:ascii="Verdana" w:hAnsi="Verdana" w:cs="Verdana" w:eastAsia="Verdana"/>
+                      <w:b/>
+                      <w:sz w:val="20"/>
+                    </w:rPr>
+                    <w:t>SAI</w:t>
+                  </w:r>
+                </w:p>
+              </w:tc>
+              <w:tc>
+                <w:tcPr>
+                  <w:tcW w:type="dxa" w:w="3700"/>
+                  <w:shd w:val="clear" w:fill="D9D9D9"/>
+                  <w:tcBorders>
+                    <w:top w:val="single" w:sz="8" w:space="0" w:color="000000"/>
+                    <w:left w:val="single" w:sz="8" w:space="0" w:color="000000"/>
+                    <w:bottom w:val="single" w:sz="8" w:space="0" w:color="000000"/>
+                    <w:right w:val="single" w:sz="8" w:space="0" w:color="000000"/>
+                  </w:tcBorders>
+                </w:tcPr>
+                <w:p>
+                  <w:r/>
+                  <w:r>
+                    <w:rPr>
+                      <w:rFonts w:ascii="Verdana" w:hAnsi="Verdana" w:cs="Verdana" w:eastAsia="Verdana"/>
+                      <w:b/>
+                      <w:sz w:val="20"/>
+                    </w:rPr>
+                    <w:t>Potència aparent (VA)</w:t>
+                  </w:r>
+                </w:p>
+              </w:tc>
+              <w:tc>
+                <w:tcPr>
+                  <w:tcW w:type="dxa" w:w="3500"/>
+                  <w:shd w:val="clear" w:fill="D9D9D9"/>
+                  <w:tcBorders>
+                    <w:top w:val="single" w:sz="8" w:space="0" w:color="000000"/>
+                    <w:left w:val="single" w:sz="8" w:space="0" w:color="000000"/>
+                    <w:bottom w:val="single" w:sz="8" w:space="0" w:color="000000"/>
+                    <w:right w:val="single" w:sz="8" w:space="0" w:color="000000"/>
+                  </w:tcBorders>
+                </w:tcPr>
+                <w:p>
+                  <w:r/>
+                  <w:r>
+                    <w:rPr>
+                      <w:rFonts w:ascii="Verdana" w:hAnsi="Verdana" w:cs="Verdana" w:eastAsia="Verdana"/>
+                      <w:b/>
+                      <w:sz w:val="20"/>
+                    </w:rPr>
+                    <w:t>Factor de potència (FP)</w:t>
+                  </w:r>
+                </w:p>
+              </w:tc>
+            </w:tr>
+            <w:tr>
+              <w:tc>
+                <w:tcPr>
+                  <w:tcW w:type="dxa" w:w="2400"/>
+                  <w:tcBorders>
+                    <w:top w:val="single" w:sz="8" w:space="0" w:color="000000"/>
+                    <w:left w:val="single" w:sz="8" w:space="0" w:color="000000"/>
+                    <w:bottom w:val="single" w:sz="8" w:space="0" w:color="000000"/>
+                    <w:right w:val="single" w:sz="8" w:space="0" w:color="000000"/>
+                  </w:tcBorders>
+                </w:tcPr>
+                <w:p>
+                  <w:r/>
+                  <w:r>
+                    <w:rPr>
+                      <w:rFonts w:ascii="Verdana" w:hAnsi="Verdana" w:cs="Verdana" w:eastAsia="Verdana"/>
+                      <w:b w:val="0"/>
+                      <w:sz w:val="20"/>
+                    </w:rPr>
+                    <w:t>SAI E</w:t>
+                  </w:r>
+                </w:p>
+              </w:tc>
+              <w:tc>
+                <w:tcPr>
+                  <w:tcW w:type="dxa" w:w="3700"/>
+                  <w:tcBorders>
+                    <w:top w:val="single" w:sz="8" w:space="0" w:color="000000"/>
+                    <w:left w:val="single" w:sz="8" w:space="0" w:color="000000"/>
+                    <w:bottom w:val="single" w:sz="8" w:space="0" w:color="000000"/>
+                    <w:right w:val="single" w:sz="8" w:space="0" w:color="000000"/>
+                  </w:tcBorders>
+                </w:tcPr>
+                <w:p>
+                  <w:r/>
+                  <w:r>
+                    <w:rPr>
+                      <w:rFonts w:ascii="Verdana" w:hAnsi="Verdana" w:cs="Verdana" w:eastAsia="Verdana"/>
+                      <w:b w:val="0"/>
+                      <w:sz w:val="20"/>
+                    </w:rPr>
+                    <w:t>650 VA</w:t>
+                  </w:r>
+                </w:p>
+              </w:tc>
+              <w:tc>
+                <w:tcPr>
+                  <w:tcW w:type="dxa" w:w="3500"/>
+                  <w:tcBorders>
+                    <w:top w:val="single" w:sz="8" w:space="0" w:color="000000"/>
+                    <w:left w:val="single" w:sz="8" w:space="0" w:color="000000"/>
+                    <w:bottom w:val="single" w:sz="8" w:space="0" w:color="000000"/>
+                    <w:right w:val="single" w:sz="8" w:space="0" w:color="000000"/>
+                  </w:tcBorders>
+                </w:tcPr>
+                <w:p>
+                  <w:r/>
+                  <w:r>
+                    <w:rPr>
+                      <w:rFonts w:ascii="Verdana" w:hAnsi="Verdana" w:cs="Verdana" w:eastAsia="Verdana"/>
+                      <w:b w:val="0"/>
+                      <w:sz w:val="20"/>
+                    </w:rPr>
+                    <w:t>0,5</w:t>
+                  </w:r>
+                </w:p>
+              </w:tc>
+            </w:tr>
+            <w:tr>
+              <w:tc>
+                <w:tcPr>
+                  <w:tcW w:type="dxa" w:w="2400"/>
+                  <w:tcBorders>
+                    <w:top w:val="single" w:sz="8" w:space="0" w:color="000000"/>
+                    <w:left w:val="single" w:sz="8" w:space="0" w:color="000000"/>
+                    <w:bottom w:val="single" w:sz="8" w:space="0" w:color="000000"/>
+                    <w:right w:val="single" w:sz="8" w:space="0" w:color="000000"/>
+                  </w:tcBorders>
+                </w:tcPr>
+                <w:p>
+                  <w:r/>
+                  <w:r>
+                    <w:rPr>
+                      <w:rFonts w:ascii="Verdana" w:hAnsi="Verdana" w:cs="Verdana" w:eastAsia="Verdana"/>
+                      <w:b w:val="0"/>
+                      <w:sz w:val="20"/>
+                    </w:rPr>
+                    <w:t>SAI F</w:t>
+                  </w:r>
+                </w:p>
+              </w:tc>
+              <w:tc>
+                <w:tcPr>
+                  <w:tcW w:type="dxa" w:w="3700"/>
+                  <w:tcBorders>
+                    <w:top w:val="single" w:sz="8" w:space="0" w:color="000000"/>
+                    <w:left w:val="single" w:sz="8" w:space="0" w:color="000000"/>
+                    <w:bottom w:val="single" w:sz="8" w:space="0" w:color="000000"/>
+                    <w:right w:val="single" w:sz="8" w:space="0" w:color="000000"/>
+                  </w:tcBorders>
+                </w:tcPr>
+                <w:p>
+                  <w:r/>
+                  <w:r>
+                    <w:rPr>
+                      <w:rFonts w:ascii="Verdana" w:hAnsi="Verdana" w:cs="Verdana" w:eastAsia="Verdana"/>
+                      <w:b w:val="0"/>
+                      <w:sz w:val="20"/>
+                    </w:rPr>
+                    <w:t>700 VA</w:t>
+                  </w:r>
+                </w:p>
+              </w:tc>
+              <w:tc>
+                <w:tcPr>
+                  <w:tcW w:type="dxa" w:w="3500"/>
+                  <w:tcBorders>
+                    <w:top w:val="single" w:sz="8" w:space="0" w:color="000000"/>
+                    <w:left w:val="single" w:sz="8" w:space="0" w:color="000000"/>
+                    <w:bottom w:val="single" w:sz="8" w:space="0" w:color="000000"/>
+                    <w:right w:val="single" w:sz="8" w:space="0" w:color="000000"/>
+                  </w:tcBorders>
+                </w:tcPr>
+                <w:p>
+                  <w:r/>
+                  <w:r>
+                    <w:rPr>
+                      <w:rFonts w:ascii="Verdana" w:hAnsi="Verdana" w:cs="Verdana" w:eastAsia="Verdana"/>
+                      <w:b w:val="0"/>
+                      <w:sz w:val="20"/>
+                    </w:rPr>
+                    <w:t>0,55</w:t>
+                  </w:r>
+                </w:p>
+              </w:tc>
+            </w:tr>
+          </w:tbl>
+          <w:p/>
+          <w:p>
+            <w:pPr>
+              <w:spacing w:line="240" w:lineRule="auto"/>
+            </w:pPr>
+            <w:r>
+              <w:rPr>
+                <w:rFonts w:ascii="Verdana" w:hAnsi="Verdana" w:cs="Verdana" w:eastAsia="Verdana"/>
+                <w:b w:val="0"/>
+                <w:sz w:val="20"/>
+              </w:rPr>
+              <w:t>Tasques: 1) Calcula la potència DC total demandada pels components. 2) Calcula la potència AC que haurà de subministrar la xarxa/SAI tenint en compte l'eficiència de la PSU. 3) Calcula la potència real disponible de cada SAI (VA × FP). 4) Aplicant un marge de seguretat del 40%, són suficients tots dos SAI? Quin recomanaries igualment, i per quin motiu (més enllà de la potència)?</w:t>
             </w:r>
           </w:p>
         </w:tc>

</xml_diff>